<commit_message>
Correct the week-numbering attribution after reading the SRS
I had recorded the conflicting formula `week = date // 7` as an SRS
contradiction. It is not in the SRS: UC10 requires only per-student, per-week
totals and Section 3.2.5 fixes day 0 as the start. The formula appears only in
the project brief, which also states the week boundaries and the pre-start
convention that contradict it.

Nothing implemented changes. `date // 7 + 1` was and remains the only reading
that satisfies every statement made about weeks anywhere, including vle.csv's
1-based week_from and week_to. What changes is that the results no longer hang
on a pending ruling, so this drops out of the design document's open issues.
</commit_message>
<xml_diff>
--- a/docs/Pokharel_CISC699_DESIGN_DOCUMENT_rev2.docx
+++ b/docs/Pokharel_CISC699_DESIGN_DOCUMENT_rev2.docx
@@ -7364,17 +7364,27 @@
         <w:t>week = date // 7 + 1</w:t>
       </w:r>
       <w:r>
-        <w:t xml:space="preserve">. The SRS gives </w:t>
+        <w:t xml:space="preserve">. The SRS specifies no formula — UC10 requires only per-student, per-week totals, and Section 3.2.5 fixes day 0 as the start with negative values before it — so this is the reading that satisfies every statement made about weeks, including vle.csv's 1-based </w:t>
       </w:r>
       <w:r>
         <w:rPr>
           <w:rFonts w:ascii="Consolas" w:hAnsi="Consolas"/>
           <w:sz w:val="20"/>
         </w:rPr>
-        <w:t>week = date // 7</w:t>
+        <w:t>week_from</w:t>
       </w:r>
       <w:r>
-        <w:t xml:space="preserve">, which contradicts both its own statement of the week boundaries and its own statement that negative dates map to week 0 or below. The convention is isolated in a single constant, </w:t>
+        <w:t xml:space="preserve"> and </w:t>
+      </w:r>
+      <w:r>
+        <w:rPr>
+          <w:rFonts w:ascii="Consolas" w:hAnsi="Consolas"/>
+          <w:sz w:val="20"/>
+        </w:rPr>
+        <w:t>week_to</w:t>
+      </w:r>
+      <w:r>
+        <w:t xml:space="preserve">. The convention is isolated in a single constant, </w:t>
       </w:r>
       <w:r>
         <w:rPr>
@@ -7384,7 +7394,7 @@
         <w:t>WEEK_OFFSET</w:t>
       </w:r>
       <w:r>
-        <w:t>. This shifts every horizon by seven days and is the one open item in Section 6 that changes every reported number.</w:t>
+        <w:t>.</w:t>
       </w:r>
     </w:p>
     <w:p>
@@ -17530,40 +17540,6 @@
       </w:r>
       <w:r>
         <w:t>.</w:t>
-      </w:r>
-    </w:p>
-    <w:p>
-      <w:pPr>
-        <w:pStyle w:val="ListBullet"/>
-      </w:pPr>
-      <w:r>
-        <w:rPr>
-          <w:b/>
-        </w:rPr>
-        <w:t>Week numbering.</w:t>
-      </w:r>
-      <w:r>
-        <w:t xml:space="preserve"> The SRS gives </w:t>
-      </w:r>
-      <w:r>
-        <w:rPr>
-          <w:rFonts w:ascii="Consolas" w:hAnsi="Consolas"/>
-          <w:sz w:val="20"/>
-        </w:rPr>
-        <w:t>week = date // 7</w:t>
-      </w:r>
-      <w:r>
-        <w:t xml:space="preserve">, which contradicts its own two other statements about week boundaries. The build uses </w:t>
-      </w:r>
-      <w:r>
-        <w:rPr>
-          <w:rFonts w:ascii="Consolas" w:hAnsi="Consolas"/>
-          <w:sz w:val="20"/>
-        </w:rPr>
-        <w:t>date // 7 + 1</w:t>
-      </w:r>
-      <w:r>
-        <w:t>, which satisfies both. This shifts every horizon by seven days and therefore changes every number in the results. It must be confirmed against the SRS before anything is quoted. This is the only open issue that changes all of them.</w:t>
       </w:r>
     </w:p>
     <w:p>

</xml_diff>